<commit_message>
feat: Redesign resume with glassmorphism UI, updated assets, and enhanced styling.
</commit_message>
<xml_diff>
--- a/assets/Mahesh Morde_Software Engineer_9766228503.docx
+++ b/assets/Mahesh Morde_Software Engineer_9766228503.docx
@@ -73,7 +73,7 @@
           <w:rPr>
             <w:rStyle w:val="Hyperlink"/>
           </w:rPr>
-          <w:t>+91 97 66 228 503</w:t>
+          <w:t>+91 9766228503</w:t>
         </w:r>
       </w:hyperlink>
       <w:r>
@@ -299,19 +299,37 @@
         <w:rPr>
           <w:color w:val="808080" w:themeColor="background1" w:themeShade="80"/>
         </w:rPr>
-        <w:t xml:space="preserve">2018 </w:t>
+        <w:t>201</w:t>
       </w:r>
       <w:r>
         <w:rPr>
           <w:color w:val="808080" w:themeColor="background1" w:themeShade="80"/>
         </w:rPr>
+        <w:t>7</w:t>
+      </w:r>
+      <w:r>
+        <w:rPr>
+          <w:color w:val="808080" w:themeColor="background1" w:themeShade="80"/>
+        </w:rPr>
+        <w:t xml:space="preserve"> </w:t>
+      </w:r>
+      <w:r>
+        <w:rPr>
+          <w:color w:val="808080" w:themeColor="background1" w:themeShade="80"/>
+        </w:rPr>
         <w:t>–</w:t>
       </w:r>
       <w:r>
         <w:rPr>
           <w:color w:val="808080" w:themeColor="background1" w:themeShade="80"/>
         </w:rPr>
-        <w:t xml:space="preserve"> 2021</w:t>
+        <w:t xml:space="preserve"> 202</w:t>
+      </w:r>
+      <w:r>
+        <w:rPr>
+          <w:color w:val="808080" w:themeColor="background1" w:themeShade="80"/>
+        </w:rPr>
+        <w:t>2</w:t>
       </w:r>
     </w:p>
     <w:p>
@@ -375,8 +393,17 @@
         <w:rPr>
           <w:b/>
         </w:rPr>
-        <w:t>2nd Runner Up – Microsoft GitHub Copilot Hackathon</w:t>
-      </w:r>
+        <w:t xml:space="preserve">2nd Runner Up </w:t>
+      </w:r>
+      <w:hyperlink r:id="rId11" w:history="1">
+        <w:r>
+          <w:rPr>
+            <w:rStyle w:val="Hyperlink"/>
+            <w:b/>
+          </w:rPr>
+          <w:t>Microsoft GitHub Copilot Hackathon (ALL INDIA RANK)</w:t>
+        </w:r>
+      </w:hyperlink>
     </w:p>
     <w:p>
       <w:pPr>
@@ -394,12 +421,6 @@
       <w:r>
         <w:t xml:space="preserve"> Code Gladiators platform</w:t>
       </w:r>
-    </w:p>
-    <w:p>
-      <w:pPr>
-        <w:pStyle w:val="ListParagraph"/>
-        <w:spacing w:after="80" w:line="240" w:lineRule="auto"/>
-      </w:pPr>
     </w:p>
     <w:p>
       <w:pPr>
@@ -546,15 +567,6 @@
         <w:spacing w:after="80" w:line="240" w:lineRule="auto"/>
         <w:ind w:left="720"/>
         <w:rPr>
-          <w:color w:val="808080" w:themeColor="background1" w:themeShade="80"/>
-        </w:rPr>
-      </w:pPr>
-    </w:p>
-    <w:p>
-      <w:pPr>
-        <w:spacing w:after="80" w:line="240" w:lineRule="auto"/>
-        <w:ind w:left="720"/>
-        <w:rPr>
           <w:b/>
         </w:rPr>
       </w:pPr>
@@ -665,18 +677,36 @@
       <w:pPr>
         <w:spacing w:after="80" w:line="240" w:lineRule="auto"/>
         <w:ind w:left="720"/>
+      </w:pPr>
+      <w:r>
         <w:rPr>
           <w:b/>
-        </w:rPr>
-      </w:pPr>
-      <w:r>
-        <w:t>As a Software Engineer, I have contributed to designing and developing scalable web applications for social-impact organizations and enterprise clients. I’ve worked on creating user-centric features, improving workflows, and building secure, multi-role platforms with strong focus on usability, performance, and maintainability. My work includes delivering end-to-end modules, integrating APIs, and collaborating closely with cross-functional teams to build reliable digital solutions.</w:t>
-      </w:r>
+          <w:bCs/>
+        </w:rPr>
+        <w:t>VMS</w:t>
+      </w:r>
+      <w:r>
+        <w:t xml:space="preserve"> (Vendor Management System) is a multi-tenant web platform used by social-impact organizations to manage vendors, users, and role-based operations across multiple clients. </w:t>
+      </w:r>
+      <w:proofErr w:type="spellStart"/>
       <w:r>
         <w:rPr>
           <w:b/>
-        </w:rPr>
-        <w:t xml:space="preserve"> </w:t>
+          <w:bCs/>
+        </w:rPr>
+        <w:t>Markify</w:t>
+      </w:r>
+      <w:proofErr w:type="spellEnd"/>
+      <w:r>
+        <w:t xml:space="preserve"> is an </w:t>
+      </w:r>
+      <w:proofErr w:type="spellStart"/>
+      <w:r>
+        <w:t>agri</w:t>
+      </w:r>
+      <w:proofErr w:type="spellEnd"/>
+      <w:r>
+        <w:t>-trading platform that enables farmers, FPOs, and warehouses to list, manage, and trade agricultural products for enterprise and NGO partners.</w:t>
       </w:r>
     </w:p>
     <w:p>
@@ -705,7 +735,7 @@
         <w:pStyle w:val="ListParagraph"/>
         <w:numPr>
           <w:ilvl w:val="0"/>
-          <w:numId w:val="23"/>
+          <w:numId w:val="29"/>
         </w:numPr>
         <w:spacing w:after="80" w:line="240" w:lineRule="auto"/>
         <w:rPr>
@@ -726,7 +756,7 @@
         <w:pStyle w:val="ListParagraph"/>
         <w:numPr>
           <w:ilvl w:val="0"/>
-          <w:numId w:val="23"/>
+          <w:numId w:val="29"/>
         </w:numPr>
         <w:spacing w:after="80" w:line="240" w:lineRule="auto"/>
         <w:rPr>
@@ -747,7 +777,7 @@
         <w:pStyle w:val="ListParagraph"/>
         <w:numPr>
           <w:ilvl w:val="0"/>
-          <w:numId w:val="23"/>
+          <w:numId w:val="29"/>
         </w:numPr>
         <w:spacing w:after="80" w:line="240" w:lineRule="auto"/>
         <w:rPr>
@@ -768,7 +798,7 @@
         <w:pStyle w:val="ListParagraph"/>
         <w:numPr>
           <w:ilvl w:val="0"/>
-          <w:numId w:val="23"/>
+          <w:numId w:val="29"/>
         </w:numPr>
         <w:spacing w:after="80" w:line="240" w:lineRule="auto"/>
         <w:rPr>
@@ -789,7 +819,7 @@
         <w:pStyle w:val="ListParagraph"/>
         <w:numPr>
           <w:ilvl w:val="0"/>
-          <w:numId w:val="23"/>
+          <w:numId w:val="29"/>
         </w:numPr>
         <w:spacing w:after="80" w:line="240" w:lineRule="auto"/>
         <w:rPr>
@@ -810,7 +840,7 @@
         <w:pStyle w:val="ListParagraph"/>
         <w:numPr>
           <w:ilvl w:val="0"/>
-          <w:numId w:val="23"/>
+          <w:numId w:val="29"/>
         </w:numPr>
         <w:spacing w:after="80" w:line="240" w:lineRule="auto"/>
         <w:rPr>
@@ -831,7 +861,7 @@
         <w:pStyle w:val="ListParagraph"/>
         <w:numPr>
           <w:ilvl w:val="0"/>
-          <w:numId w:val="23"/>
+          <w:numId w:val="29"/>
         </w:numPr>
         <w:spacing w:after="80" w:line="240" w:lineRule="auto"/>
         <w:rPr>
@@ -852,7 +882,7 @@
         <w:pStyle w:val="ListParagraph"/>
         <w:numPr>
           <w:ilvl w:val="0"/>
-          <w:numId w:val="23"/>
+          <w:numId w:val="29"/>
         </w:numPr>
         <w:spacing w:after="80" w:line="240" w:lineRule="auto"/>
         <w:rPr>
@@ -889,7 +919,7 @@
         <w:pStyle w:val="ListParagraph"/>
         <w:numPr>
           <w:ilvl w:val="0"/>
-          <w:numId w:val="23"/>
+          <w:numId w:val="29"/>
         </w:numPr>
         <w:spacing w:after="80" w:line="240" w:lineRule="auto"/>
         <w:rPr>
@@ -904,24 +934,6 @@
         </w:rPr>
         <w:t>Collaborated with cross-functional teams to ensure stable, high-quality feature delivery.</w:t>
       </w:r>
-    </w:p>
-    <w:p>
-      <w:pPr>
-        <w:spacing w:after="80" w:line="240" w:lineRule="auto"/>
-        <w:rPr>
-          <w:color w:val="000000"/>
-          <w:lang w:val="en-US"/>
-        </w:rPr>
-      </w:pPr>
-    </w:p>
-    <w:p>
-      <w:pPr>
-        <w:spacing w:after="80" w:line="240" w:lineRule="auto"/>
-        <w:rPr>
-          <w:color w:val="000000"/>
-          <w:lang w:val="en-US"/>
-        </w:rPr>
-      </w:pPr>
     </w:p>
     <w:p>
       <w:pPr>
@@ -941,24 +953,20 @@
           <w:bCs/>
           <w:lang w:val="en-US"/>
         </w:rPr>
-        <w:lastRenderedPageBreak/>
         <w:t xml:space="preserve">        </w:t>
       </w:r>
       <w:r>
         <w:rPr>
           <w:b/>
-          <w:bCs/>
-          <w:lang w:val="en-US"/>
         </w:rPr>
         <w:t xml:space="preserve">2. </w:t>
       </w:r>
+      <w:proofErr w:type="gramStart"/>
       <w:r>
         <w:rPr>
           <w:b/>
-          <w:bCs/>
-          <w:lang w:val="en-US"/>
-        </w:rPr>
-        <w:t>Catalog Associate</w:t>
+        </w:rPr>
+        <w:t>Associate</w:t>
       </w:r>
       <w:r>
         <w:rPr>
@@ -972,6 +980,13 @@
         </w:rPr>
         <w:t xml:space="preserve"> </w:t>
       </w:r>
+      <w:r>
+        <w:rPr>
+          <w:b/>
+        </w:rPr>
+        <w:t>Engineer</w:t>
+      </w:r>
+      <w:proofErr w:type="gramEnd"/>
     </w:p>
     <w:p>
       <w:pPr>
@@ -1092,115 +1107,31 @@
     </w:p>
     <w:p>
       <w:pPr>
+        <w:pBdr>
+          <w:top w:val="nil"/>
+          <w:left w:val="nil"/>
+          <w:bottom w:val="nil"/>
+          <w:right w:val="nil"/>
+          <w:between w:val="nil"/>
+        </w:pBdr>
         <w:spacing w:after="80" w:line="240" w:lineRule="auto"/>
-        <w:ind w:left="720"/>
-      </w:pPr>
+        <w:ind w:firstLine="720"/>
+        <w:rPr>
+          <w:b/>
+        </w:rPr>
+      </w:pPr>
+      <w:r>
+        <w:rPr>
+          <w:b/>
+        </w:rPr>
+        <w:t>Projects: Vendor Order Management System (VOMS), Catalog Quality Improvement System (CQIS)</w:t>
+      </w:r>
     </w:p>
     <w:p>
       <w:pPr>
-        <w:pStyle w:val="ListParagraph"/>
-        <w:spacing w:after="80" w:line="240" w:lineRule="auto"/>
-        <w:rPr>
-          <w:b/>
-        </w:rPr>
-      </w:pPr>
-      <w:r>
-        <w:rPr>
-          <w:b/>
-        </w:rPr>
-        <w:t xml:space="preserve">Project – </w:t>
-      </w:r>
-      <w:proofErr w:type="spellStart"/>
-      <w:r>
-        <w:rPr>
-          <w:b/>
-          <w:bCs/>
-        </w:rPr>
-        <w:t>Catalog</w:t>
-      </w:r>
-      <w:proofErr w:type="spellEnd"/>
-      <w:r>
-        <w:rPr>
-          <w:b/>
-          <w:bCs/>
-        </w:rPr>
-        <w:t xml:space="preserve"> Quality Improvement System (CQIS)</w:t>
-      </w:r>
-      <w:r>
-        <w:rPr>
-          <w:b/>
-          <w:bCs/>
-        </w:rPr>
-        <w:t xml:space="preserve">, </w:t>
-      </w:r>
-      <w:r>
-        <w:rPr>
-          <w:b/>
-          <w:bCs/>
-        </w:rPr>
-        <w:t>Competitor Pricing Analysis Framework (CPAF)</w:t>
-      </w:r>
-    </w:p>
-    <w:p>
-      <w:pPr>
-        <w:spacing w:after="80" w:line="240" w:lineRule="auto"/>
-        <w:ind w:left="720"/>
-      </w:pPr>
-      <w:r>
-        <w:t xml:space="preserve">As a </w:t>
-      </w:r>
-      <w:proofErr w:type="spellStart"/>
-      <w:r>
-        <w:t>Catalog</w:t>
-      </w:r>
-      <w:proofErr w:type="spellEnd"/>
-      <w:r>
-        <w:t xml:space="preserve"> Associate at Amazon, I supported large-scale </w:t>
-      </w:r>
-      <w:proofErr w:type="spellStart"/>
-      <w:r>
-        <w:t>catalog</w:t>
-      </w:r>
-      <w:proofErr w:type="spellEnd"/>
-      <w:r>
-        <w:t xml:space="preserve"> operations through data analysis, process optimization, and quality assurance. I worked on improving </w:t>
-      </w:r>
-      <w:proofErr w:type="spellStart"/>
-      <w:r>
-        <w:t>catalog</w:t>
-      </w:r>
-      <w:proofErr w:type="spellEnd"/>
-      <w:r>
-        <w:t xml:space="preserve"> accuracy, resolving listing issues, and ensuring smooth workflows across teams while contributing to better customer experience and operational efficiency.</w:t>
-      </w:r>
-    </w:p>
-    <w:p>
-      <w:pPr>
-        <w:spacing w:after="80" w:line="240" w:lineRule="auto"/>
-        <w:ind w:firstLine="720"/>
-        <w:rPr>
-          <w:b/>
-        </w:rPr>
-      </w:pPr>
-      <w:r>
-        <w:rPr>
-          <w:b/>
-        </w:rPr>
-        <w:t>Responsibilities</w:t>
-      </w:r>
-      <w:r>
-        <w:rPr>
-          <w:b/>
-        </w:rPr>
-        <w:t>:</w:t>
-      </w:r>
-    </w:p>
-    <w:p>
-      <w:pPr>
-        <w:pStyle w:val="ListParagraph"/>
         <w:numPr>
           <w:ilvl w:val="0"/>
-          <w:numId w:val="25"/>
+          <w:numId w:val="27"/>
         </w:numPr>
         <w:pBdr>
           <w:top w:val="nil"/>
@@ -1209,26 +1140,22 @@
           <w:right w:val="nil"/>
           <w:between w:val="nil"/>
         </w:pBdr>
+        <w:tabs>
+          <w:tab w:val="clear" w:pos="720"/>
+          <w:tab w:val="num" w:pos="1080"/>
+        </w:tabs>
         <w:spacing w:after="80" w:line="240" w:lineRule="auto"/>
-        <w:rPr>
-          <w:color w:val="000000"/>
-          <w:lang w:val="en-US"/>
-        </w:rPr>
-      </w:pPr>
-      <w:r>
-        <w:rPr>
-          <w:color w:val="000000"/>
-          <w:lang w:val="en-US"/>
-        </w:rPr>
-        <w:t>Analyzed competitor pricing and market trends to support pricing strategy decisions.</w:t>
+        <w:ind w:left="1080"/>
+      </w:pPr>
+      <w:r>
+        <w:t>VOMS is an internal Angular-based application designed to streamline large-scale vendor order placement and automated processing, ensuring seamless supply chain integration.</w:t>
       </w:r>
     </w:p>
     <w:p>
       <w:pPr>
-        <w:pStyle w:val="ListParagraph"/>
         <w:numPr>
           <w:ilvl w:val="0"/>
-          <w:numId w:val="25"/>
+          <w:numId w:val="27"/>
         </w:numPr>
         <w:pBdr>
           <w:top w:val="nil"/>
@@ -1237,26 +1164,45 @@
           <w:right w:val="nil"/>
           <w:between w:val="nil"/>
         </w:pBdr>
+        <w:tabs>
+          <w:tab w:val="clear" w:pos="720"/>
+          <w:tab w:val="num" w:pos="1080"/>
+        </w:tabs>
         <w:spacing w:after="80" w:line="240" w:lineRule="auto"/>
-        <w:rPr>
-          <w:color w:val="000000"/>
-          <w:lang w:val="en-US"/>
-        </w:rPr>
-      </w:pPr>
-      <w:r>
-        <w:rPr>
-          <w:color w:val="000000"/>
-          <w:lang w:val="en-US"/>
-        </w:rPr>
-        <w:t>Performed data extraction, validation, and reporting to improve catalog accuracy.</w:t>
+        <w:ind w:left="1080"/>
+      </w:pPr>
+      <w:r>
+        <w:lastRenderedPageBreak/>
+        <w:t>CQIS &amp; CPAF are data-driven frameworks used to enhance catalog accuracy and analyze global competitor pricing trends for strategic decision-making.</w:t>
       </w:r>
     </w:p>
     <w:p>
       <w:pPr>
-        <w:pStyle w:val="ListParagraph"/>
+        <w:pBdr>
+          <w:top w:val="nil"/>
+          <w:left w:val="nil"/>
+          <w:bottom w:val="nil"/>
+          <w:right w:val="nil"/>
+          <w:between w:val="nil"/>
+        </w:pBdr>
+        <w:spacing w:after="80" w:line="240" w:lineRule="auto"/>
+        <w:ind w:left="360"/>
+        <w:rPr>
+          <w:b/>
+        </w:rPr>
+      </w:pPr>
+      <w:r>
+        <w:rPr>
+          <w:b/>
+        </w:rPr>
+        <w:t>Responsibilities:</w:t>
+      </w:r>
+    </w:p>
+    <w:p>
+      <w:pPr>
         <w:numPr>
           <w:ilvl w:val="0"/>
-          <w:numId w:val="25"/>
+          <w:numId w:val="28"/>
         </w:numPr>
         <w:pBdr>
           <w:top w:val="nil"/>
@@ -1265,7 +1211,12 @@
           <w:right w:val="nil"/>
           <w:between w:val="nil"/>
         </w:pBdr>
+        <w:tabs>
+          <w:tab w:val="clear" w:pos="720"/>
+          <w:tab w:val="num" w:pos="1080"/>
+        </w:tabs>
         <w:spacing w:after="80" w:line="240" w:lineRule="auto"/>
+        <w:ind w:left="1080"/>
         <w:rPr>
           <w:color w:val="000000"/>
           <w:lang w:val="en-US"/>
@@ -1276,15 +1227,14 @@
           <w:color w:val="000000"/>
           <w:lang w:val="en-US"/>
         </w:rPr>
-        <w:t>Identified listing issues and implemented corrective actions to maintain catalog quality.</w:t>
+        <w:t>Developed and maintained an internal Angular application used by procurement teams to manage, validate, and place high-volume vendor orders.</w:t>
       </w:r>
     </w:p>
     <w:p>
       <w:pPr>
-        <w:pStyle w:val="ListParagraph"/>
         <w:numPr>
           <w:ilvl w:val="0"/>
-          <w:numId w:val="25"/>
+          <w:numId w:val="28"/>
         </w:numPr>
         <w:pBdr>
           <w:top w:val="nil"/>
@@ -1293,7 +1243,12 @@
           <w:right w:val="nil"/>
           <w:between w:val="nil"/>
         </w:pBdr>
+        <w:tabs>
+          <w:tab w:val="clear" w:pos="720"/>
+          <w:tab w:val="num" w:pos="1080"/>
+        </w:tabs>
         <w:spacing w:after="80" w:line="240" w:lineRule="auto"/>
+        <w:ind w:left="1080"/>
         <w:rPr>
           <w:color w:val="000000"/>
           <w:lang w:val="en-US"/>
@@ -1304,15 +1259,14 @@
           <w:color w:val="000000"/>
           <w:lang w:val="en-US"/>
         </w:rPr>
-        <w:t>Coordinated with cross-regional teams to resolve catalog and operational discrepancies.</w:t>
+        <w:t>Built modular UI components to handle complex data grids and order-processing workflows, improving internal operational efficiency by 30%.</w:t>
       </w:r>
     </w:p>
     <w:p>
       <w:pPr>
-        <w:pStyle w:val="ListParagraph"/>
         <w:numPr>
           <w:ilvl w:val="0"/>
-          <w:numId w:val="25"/>
+          <w:numId w:val="28"/>
         </w:numPr>
         <w:pBdr>
           <w:top w:val="nil"/>
@@ -1321,7 +1275,12 @@
           <w:right w:val="nil"/>
           <w:between w:val="nil"/>
         </w:pBdr>
+        <w:tabs>
+          <w:tab w:val="clear" w:pos="720"/>
+          <w:tab w:val="num" w:pos="1080"/>
+        </w:tabs>
         <w:spacing w:after="80" w:line="240" w:lineRule="auto"/>
+        <w:ind w:left="1080"/>
         <w:rPr>
           <w:color w:val="000000"/>
           <w:lang w:val="en-US"/>
@@ -1332,15 +1291,14 @@
           <w:color w:val="000000"/>
           <w:lang w:val="en-US"/>
         </w:rPr>
-        <w:t>Led and mentored a team through audits, workflow improvements, and daily processes.</w:t>
+        <w:t>Integrated RESTful APIs to synchronize real-time catalog data between the internal ordering system and Amazon’s global databases.</w:t>
       </w:r>
     </w:p>
     <w:p>
       <w:pPr>
-        <w:pStyle w:val="ListParagraph"/>
         <w:numPr>
           <w:ilvl w:val="0"/>
-          <w:numId w:val="25"/>
+          <w:numId w:val="28"/>
         </w:numPr>
         <w:pBdr>
           <w:top w:val="nil"/>
@@ -1349,7 +1307,12 @@
           <w:right w:val="nil"/>
           <w:between w:val="nil"/>
         </w:pBdr>
+        <w:tabs>
+          <w:tab w:val="clear" w:pos="720"/>
+          <w:tab w:val="num" w:pos="1080"/>
+        </w:tabs>
         <w:spacing w:after="80" w:line="240" w:lineRule="auto"/>
+        <w:ind w:left="1080"/>
         <w:rPr>
           <w:color w:val="000000"/>
           <w:lang w:val="en-US"/>
@@ -1360,7 +1323,103 @@
           <w:color w:val="000000"/>
           <w:lang w:val="en-US"/>
         </w:rPr>
-        <w:t>Supported automation initiatives to reduce manual workload and improve efficiency.</w:t>
+        <w:t>Collaborated on the Competitor Pricing Analysis Framework (CPAF) by developing scripts to automate data extraction and validation, reducing manual audit time.</w:t>
+      </w:r>
+    </w:p>
+    <w:p>
+      <w:pPr>
+        <w:numPr>
+          <w:ilvl w:val="0"/>
+          <w:numId w:val="28"/>
+        </w:numPr>
+        <w:pBdr>
+          <w:top w:val="nil"/>
+          <w:left w:val="nil"/>
+          <w:bottom w:val="nil"/>
+          <w:right w:val="nil"/>
+          <w:between w:val="nil"/>
+        </w:pBdr>
+        <w:tabs>
+          <w:tab w:val="clear" w:pos="720"/>
+          <w:tab w:val="num" w:pos="1080"/>
+        </w:tabs>
+        <w:spacing w:after="80" w:line="240" w:lineRule="auto"/>
+        <w:ind w:left="1080"/>
+        <w:rPr>
+          <w:color w:val="000000"/>
+          <w:lang w:val="en-US"/>
+        </w:rPr>
+      </w:pPr>
+      <w:r>
+        <w:rPr>
+          <w:color w:val="000000"/>
+          <w:lang w:val="en-US"/>
+        </w:rPr>
+        <w:t>Implemented role-based dashboards within internal tools to provide regional managers with visibility into catalog quality metrics and pricing discrepancies.</w:t>
+      </w:r>
+    </w:p>
+    <w:p>
+      <w:pPr>
+        <w:numPr>
+          <w:ilvl w:val="0"/>
+          <w:numId w:val="28"/>
+        </w:numPr>
+        <w:pBdr>
+          <w:top w:val="nil"/>
+          <w:left w:val="nil"/>
+          <w:bottom w:val="nil"/>
+          <w:right w:val="nil"/>
+          <w:between w:val="nil"/>
+        </w:pBdr>
+        <w:tabs>
+          <w:tab w:val="clear" w:pos="720"/>
+          <w:tab w:val="num" w:pos="1080"/>
+        </w:tabs>
+        <w:spacing w:after="80" w:line="240" w:lineRule="auto"/>
+        <w:ind w:left="1080"/>
+        <w:rPr>
+          <w:color w:val="000000"/>
+          <w:lang w:val="en-US"/>
+        </w:rPr>
+      </w:pPr>
+      <w:r>
+        <w:rPr>
+          <w:color w:val="000000"/>
+          <w:lang w:val="en-US"/>
+        </w:rPr>
+        <w:t>Led technical audits and mentored junior team members on workflow automation and best practices for maintaining data integrity at scale.</w:t>
+      </w:r>
+    </w:p>
+    <w:p>
+      <w:pPr>
+        <w:numPr>
+          <w:ilvl w:val="0"/>
+          <w:numId w:val="28"/>
+        </w:numPr>
+        <w:pBdr>
+          <w:top w:val="nil"/>
+          <w:left w:val="nil"/>
+          <w:bottom w:val="nil"/>
+          <w:right w:val="nil"/>
+          <w:between w:val="nil"/>
+        </w:pBdr>
+        <w:tabs>
+          <w:tab w:val="clear" w:pos="720"/>
+          <w:tab w:val="num" w:pos="1080"/>
+        </w:tabs>
+        <w:spacing w:after="80" w:line="240" w:lineRule="auto"/>
+        <w:ind w:left="1080"/>
+        <w:rPr>
+          <w:color w:val="000000"/>
+          <w:lang w:val="en-US"/>
+        </w:rPr>
+      </w:pPr>
+      <w:r>
+        <w:rPr>
+          <w:color w:val="000000"/>
+          <w:lang w:val="en-US"/>
+        </w:rPr>
+        <w:t>Coordinated with cross-functional engineering teams to resolve system bottlenecks and ensure the stability of catalog improvement tools.</w:t>
       </w:r>
     </w:p>
     <w:p>
@@ -1571,214 +1630,6 @@
     <w:p>
       <w:pPr>
         <w:spacing w:after="80" w:line="240" w:lineRule="auto"/>
-      </w:pPr>
-    </w:p>
-    <w:p>
-      <w:pPr>
-        <w:spacing w:after="80" w:line="240" w:lineRule="auto"/>
-        <w:rPr>
-          <w:b/>
-          <w:bCs/>
-          <w:i/>
-          <w:iCs/>
-          <w:color w:val="4F81BD" w:themeColor="accent1"/>
-          <w:sz w:val="28"/>
-          <w:szCs w:val="28"/>
-        </w:rPr>
-      </w:pPr>
-      <w:r>
-        <w:rPr>
-          <w:rStyle w:val="IntenseEmphasis"/>
-          <w:sz w:val="28"/>
-          <w:szCs w:val="28"/>
-        </w:rPr>
-        <w:t>SKILLS</w:t>
-      </w:r>
-    </w:p>
-    <w:p>
-      <w:pPr>
-        <w:spacing w:after="80" w:line="240" w:lineRule="auto"/>
-        <w:rPr>
-          <w:color w:val="000000"/>
-        </w:rPr>
-      </w:pPr>
-      <w:r>
-        <w:rPr>
-          <w:b/>
-          <w:bCs/>
-          <w:color w:val="000000"/>
-        </w:rPr>
-        <w:t xml:space="preserve">       </w:t>
-      </w:r>
-      <w:r>
-        <w:rPr>
-          <w:b/>
-          <w:bCs/>
-          <w:color w:val="000000"/>
-        </w:rPr>
-        <w:t>Frontend</w:t>
-      </w:r>
-      <w:r>
-        <w:rPr>
-          <w:color w:val="000000"/>
-        </w:rPr>
-        <w:t>: HTML5, CSS3, JavaScript, TypeScript, Bootstrap, Responsive UI, Component-Based Architecture</w:t>
-      </w:r>
-      <w:r>
-        <w:rPr>
-          <w:b/>
-          <w:color w:val="000000"/>
-        </w:rPr>
-        <w:br/>
-      </w:r>
-      <w:r>
-        <w:rPr>
-          <w:b/>
-          <w:bCs/>
-          <w:color w:val="000000"/>
-        </w:rPr>
-        <w:t xml:space="preserve">       </w:t>
-      </w:r>
-      <w:r>
-        <w:rPr>
-          <w:b/>
-          <w:bCs/>
-          <w:color w:val="000000"/>
-        </w:rPr>
-        <w:t>Web Development</w:t>
-      </w:r>
-      <w:r>
-        <w:rPr>
-          <w:color w:val="000000"/>
-        </w:rPr>
-        <w:t>: Modular Design, Profiling &amp; Optimization, Form Handling, API Integration</w:t>
-      </w:r>
-      <w:r>
-        <w:rPr>
-          <w:color w:val="000000"/>
-        </w:rPr>
-        <w:br/>
-      </w:r>
-      <w:r>
-        <w:rPr>
-          <w:b/>
-          <w:bCs/>
-          <w:color w:val="000000"/>
-        </w:rPr>
-        <w:t xml:space="preserve">       </w:t>
-      </w:r>
-      <w:r>
-        <w:rPr>
-          <w:b/>
-          <w:bCs/>
-          <w:color w:val="000000"/>
-        </w:rPr>
-        <w:t>Backend</w:t>
-      </w:r>
-      <w:r>
-        <w:rPr>
-          <w:color w:val="000000"/>
-        </w:rPr>
-        <w:t>: Python, Django, SQL, REST APIs</w:t>
-      </w:r>
-      <w:r>
-        <w:rPr>
-          <w:color w:val="000000"/>
-        </w:rPr>
-        <w:br/>
-      </w:r>
-      <w:r>
-        <w:rPr>
-          <w:b/>
-          <w:bCs/>
-          <w:color w:val="000000"/>
-        </w:rPr>
-        <w:t xml:space="preserve">       </w:t>
-      </w:r>
-      <w:r>
-        <w:rPr>
-          <w:b/>
-          <w:bCs/>
-          <w:color w:val="000000"/>
-        </w:rPr>
-        <w:t>Databases</w:t>
-      </w:r>
-      <w:r>
-        <w:rPr>
-          <w:color w:val="000000"/>
-        </w:rPr>
-        <w:t>: MySQL, PostgreSQL, MongoDB</w:t>
-      </w:r>
-      <w:r>
-        <w:rPr>
-          <w:color w:val="000000"/>
-        </w:rPr>
-        <w:br/>
-      </w:r>
-      <w:r>
-        <w:rPr>
-          <w:b/>
-          <w:bCs/>
-          <w:color w:val="000000"/>
-        </w:rPr>
-        <w:t xml:space="preserve">       </w:t>
-      </w:r>
-      <w:r>
-        <w:rPr>
-          <w:b/>
-          <w:bCs/>
-          <w:color w:val="000000"/>
-        </w:rPr>
-        <w:t>Cloud &amp; Tools</w:t>
-      </w:r>
-      <w:r>
-        <w:rPr>
-          <w:color w:val="000000"/>
-        </w:rPr>
-        <w:t>: AWS (S3), Docker, Git, GitHub, CI/CD</w:t>
-      </w:r>
-      <w:r>
-        <w:rPr>
-          <w:color w:val="000000"/>
-        </w:rPr>
-        <w:br/>
-      </w:r>
-      <w:r>
-        <w:rPr>
-          <w:b/>
-          <w:bCs/>
-          <w:color w:val="000000"/>
-        </w:rPr>
-        <w:t xml:space="preserve">       </w:t>
-      </w:r>
-      <w:r>
-        <w:rPr>
-          <w:b/>
-          <w:bCs/>
-          <w:color w:val="000000"/>
-        </w:rPr>
-        <w:t>Others</w:t>
-      </w:r>
-      <w:r>
-        <w:rPr>
-          <w:color w:val="000000"/>
-        </w:rPr>
-        <w:t>: Agile, Debugging, Automation, Data Validation</w:t>
-      </w:r>
-    </w:p>
-    <w:p>
-      <w:pPr>
-        <w:spacing w:after="80" w:line="240" w:lineRule="auto"/>
-        <w:ind w:left="720"/>
-        <w:rPr>
-          <w:b/>
-          <w:bCs/>
-          <w:i/>
-          <w:iCs/>
-          <w:color w:val="4F81BD" w:themeColor="accent1"/>
-          <w:sz w:val="28"/>
-          <w:szCs w:val="28"/>
-        </w:rPr>
         <w:sectPr>
           <w:type w:val="continuous"/>
           <w:pgSz w:w="11906" w:h="16838"/>
@@ -2878,6 +2729,95 @@
     </w:lvl>
   </w:abstractNum>
   <w:abstractNum w:abstractNumId="9" w15:restartNumberingAfterBreak="0">
+    <w:nsid w:val="31844D27"/>
+    <w:multiLevelType w:val="hybridMultilevel"/>
+    <w:tmpl w:val="D82A5EAA"/>
+    <w:lvl w:ilvl="0" w:tplc="04090001">
+      <w:start w:val="1"/>
+      <w:numFmt w:val="bullet"/>
+      <w:lvlText w:val=""/>
+      <w:lvlJc w:val="left"/>
+      <w:pPr>
+        <w:ind w:left="1080" w:hanging="360"/>
+      </w:pPr>
+      <w:rPr>
+        <w:rFonts w:ascii="Symbol" w:hAnsi="Symbol" w:hint="default"/>
+      </w:rPr>
+    </w:lvl>
+    <w:lvl w:ilvl="1" w:tplc="FFFFFFFF" w:tentative="1">
+      <w:start w:val="1"/>
+      <w:numFmt w:val="lowerLetter"/>
+      <w:lvlText w:val="%2."/>
+      <w:lvlJc w:val="left"/>
+      <w:pPr>
+        <w:ind w:left="1800" w:hanging="360"/>
+      </w:pPr>
+    </w:lvl>
+    <w:lvl w:ilvl="2" w:tplc="FFFFFFFF" w:tentative="1">
+      <w:start w:val="1"/>
+      <w:numFmt w:val="lowerRoman"/>
+      <w:lvlText w:val="%3."/>
+      <w:lvlJc w:val="right"/>
+      <w:pPr>
+        <w:ind w:left="2520" w:hanging="180"/>
+      </w:pPr>
+    </w:lvl>
+    <w:lvl w:ilvl="3" w:tplc="FFFFFFFF" w:tentative="1">
+      <w:start w:val="1"/>
+      <w:numFmt w:val="decimal"/>
+      <w:lvlText w:val="%4."/>
+      <w:lvlJc w:val="left"/>
+      <w:pPr>
+        <w:ind w:left="3240" w:hanging="360"/>
+      </w:pPr>
+    </w:lvl>
+    <w:lvl w:ilvl="4" w:tplc="FFFFFFFF" w:tentative="1">
+      <w:start w:val="1"/>
+      <w:numFmt w:val="lowerLetter"/>
+      <w:lvlText w:val="%5."/>
+      <w:lvlJc w:val="left"/>
+      <w:pPr>
+        <w:ind w:left="3960" w:hanging="360"/>
+      </w:pPr>
+    </w:lvl>
+    <w:lvl w:ilvl="5" w:tplc="FFFFFFFF" w:tentative="1">
+      <w:start w:val="1"/>
+      <w:numFmt w:val="lowerRoman"/>
+      <w:lvlText w:val="%6."/>
+      <w:lvlJc w:val="right"/>
+      <w:pPr>
+        <w:ind w:left="4680" w:hanging="180"/>
+      </w:pPr>
+    </w:lvl>
+    <w:lvl w:ilvl="6" w:tplc="FFFFFFFF" w:tentative="1">
+      <w:start w:val="1"/>
+      <w:numFmt w:val="decimal"/>
+      <w:lvlText w:val="%7."/>
+      <w:lvlJc w:val="left"/>
+      <w:pPr>
+        <w:ind w:left="5400" w:hanging="360"/>
+      </w:pPr>
+    </w:lvl>
+    <w:lvl w:ilvl="7" w:tplc="FFFFFFFF" w:tentative="1">
+      <w:start w:val="1"/>
+      <w:numFmt w:val="lowerLetter"/>
+      <w:lvlText w:val="%8."/>
+      <w:lvlJc w:val="left"/>
+      <w:pPr>
+        <w:ind w:left="6120" w:hanging="360"/>
+      </w:pPr>
+    </w:lvl>
+    <w:lvl w:ilvl="8" w:tplc="FFFFFFFF" w:tentative="1">
+      <w:start w:val="1"/>
+      <w:numFmt w:val="lowerRoman"/>
+      <w:lvlText w:val="%9."/>
+      <w:lvlJc w:val="right"/>
+      <w:pPr>
+        <w:ind w:left="6840" w:hanging="180"/>
+      </w:pPr>
+    </w:lvl>
+  </w:abstractNum>
+  <w:abstractNum w:abstractNumId="10" w15:restartNumberingAfterBreak="0">
     <w:nsid w:val="34CA5E57"/>
     <w:multiLevelType w:val="hybridMultilevel"/>
     <w:tmpl w:val="135854E0"/>
@@ -2963,7 +2903,7 @@
       </w:pPr>
     </w:lvl>
   </w:abstractNum>
-  <w:abstractNum w:abstractNumId="10" w15:restartNumberingAfterBreak="0">
+  <w:abstractNum w:abstractNumId="11" w15:restartNumberingAfterBreak="0">
     <w:nsid w:val="38DE51EE"/>
     <w:multiLevelType w:val="hybridMultilevel"/>
     <w:tmpl w:val="CB50524E"/>
@@ -3049,7 +2989,7 @@
       </w:pPr>
     </w:lvl>
   </w:abstractNum>
-  <w:abstractNum w:abstractNumId="11" w15:restartNumberingAfterBreak="0">
+  <w:abstractNum w:abstractNumId="12" w15:restartNumberingAfterBreak="0">
     <w:nsid w:val="3BB37E77"/>
     <w:multiLevelType w:val="hybridMultilevel"/>
     <w:tmpl w:val="445C0A20"/>
@@ -3161,7 +3101,7 @@
       </w:rPr>
     </w:lvl>
   </w:abstractNum>
-  <w:abstractNum w:abstractNumId="12" w15:restartNumberingAfterBreak="0">
+  <w:abstractNum w:abstractNumId="13" w15:restartNumberingAfterBreak="0">
     <w:nsid w:val="3E4B0777"/>
     <w:multiLevelType w:val="hybridMultilevel"/>
     <w:tmpl w:val="2F9CF1DE"/>
@@ -3247,7 +3187,305 @@
       </w:pPr>
     </w:lvl>
   </w:abstractNum>
-  <w:abstractNum w:abstractNumId="13" w15:restartNumberingAfterBreak="0">
+  <w:abstractNum w:abstractNumId="14" w15:restartNumberingAfterBreak="0">
+    <w:nsid w:val="443268FB"/>
+    <w:multiLevelType w:val="multilevel"/>
+    <w:tmpl w:val="425663FC"/>
+    <w:lvl w:ilvl="0">
+      <w:start w:val="1"/>
+      <w:numFmt w:val="bullet"/>
+      <w:lvlText w:val=""/>
+      <w:lvlJc w:val="left"/>
+      <w:pPr>
+        <w:tabs>
+          <w:tab w:val="num" w:pos="720"/>
+        </w:tabs>
+        <w:ind w:left="720" w:hanging="360"/>
+      </w:pPr>
+      <w:rPr>
+        <w:rFonts w:ascii="Symbol" w:hAnsi="Symbol" w:hint="default"/>
+        <w:sz w:val="20"/>
+      </w:rPr>
+    </w:lvl>
+    <w:lvl w:ilvl="1" w:tentative="1">
+      <w:start w:val="1"/>
+      <w:numFmt w:val="bullet"/>
+      <w:lvlText w:val="o"/>
+      <w:lvlJc w:val="left"/>
+      <w:pPr>
+        <w:tabs>
+          <w:tab w:val="num" w:pos="1440"/>
+        </w:tabs>
+        <w:ind w:left="1440" w:hanging="360"/>
+      </w:pPr>
+      <w:rPr>
+        <w:rFonts w:ascii="Courier New" w:hAnsi="Courier New" w:hint="default"/>
+        <w:sz w:val="20"/>
+      </w:rPr>
+    </w:lvl>
+    <w:lvl w:ilvl="2" w:tentative="1">
+      <w:start w:val="1"/>
+      <w:numFmt w:val="bullet"/>
+      <w:lvlText w:val=""/>
+      <w:lvlJc w:val="left"/>
+      <w:pPr>
+        <w:tabs>
+          <w:tab w:val="num" w:pos="2160"/>
+        </w:tabs>
+        <w:ind w:left="2160" w:hanging="360"/>
+      </w:pPr>
+      <w:rPr>
+        <w:rFonts w:ascii="Wingdings" w:hAnsi="Wingdings" w:hint="default"/>
+        <w:sz w:val="20"/>
+      </w:rPr>
+    </w:lvl>
+    <w:lvl w:ilvl="3" w:tentative="1">
+      <w:start w:val="1"/>
+      <w:numFmt w:val="bullet"/>
+      <w:lvlText w:val=""/>
+      <w:lvlJc w:val="left"/>
+      <w:pPr>
+        <w:tabs>
+          <w:tab w:val="num" w:pos="2880"/>
+        </w:tabs>
+        <w:ind w:left="2880" w:hanging="360"/>
+      </w:pPr>
+      <w:rPr>
+        <w:rFonts w:ascii="Wingdings" w:hAnsi="Wingdings" w:hint="default"/>
+        <w:sz w:val="20"/>
+      </w:rPr>
+    </w:lvl>
+    <w:lvl w:ilvl="4" w:tentative="1">
+      <w:start w:val="1"/>
+      <w:numFmt w:val="bullet"/>
+      <w:lvlText w:val=""/>
+      <w:lvlJc w:val="left"/>
+      <w:pPr>
+        <w:tabs>
+          <w:tab w:val="num" w:pos="3600"/>
+        </w:tabs>
+        <w:ind w:left="3600" w:hanging="360"/>
+      </w:pPr>
+      <w:rPr>
+        <w:rFonts w:ascii="Wingdings" w:hAnsi="Wingdings" w:hint="default"/>
+        <w:sz w:val="20"/>
+      </w:rPr>
+    </w:lvl>
+    <w:lvl w:ilvl="5" w:tentative="1">
+      <w:start w:val="1"/>
+      <w:numFmt w:val="bullet"/>
+      <w:lvlText w:val=""/>
+      <w:lvlJc w:val="left"/>
+      <w:pPr>
+        <w:tabs>
+          <w:tab w:val="num" w:pos="4320"/>
+        </w:tabs>
+        <w:ind w:left="4320" w:hanging="360"/>
+      </w:pPr>
+      <w:rPr>
+        <w:rFonts w:ascii="Wingdings" w:hAnsi="Wingdings" w:hint="default"/>
+        <w:sz w:val="20"/>
+      </w:rPr>
+    </w:lvl>
+    <w:lvl w:ilvl="6" w:tentative="1">
+      <w:start w:val="1"/>
+      <w:numFmt w:val="bullet"/>
+      <w:lvlText w:val=""/>
+      <w:lvlJc w:val="left"/>
+      <w:pPr>
+        <w:tabs>
+          <w:tab w:val="num" w:pos="5040"/>
+        </w:tabs>
+        <w:ind w:left="5040" w:hanging="360"/>
+      </w:pPr>
+      <w:rPr>
+        <w:rFonts w:ascii="Wingdings" w:hAnsi="Wingdings" w:hint="default"/>
+        <w:sz w:val="20"/>
+      </w:rPr>
+    </w:lvl>
+    <w:lvl w:ilvl="7" w:tentative="1">
+      <w:start w:val="1"/>
+      <w:numFmt w:val="bullet"/>
+      <w:lvlText w:val=""/>
+      <w:lvlJc w:val="left"/>
+      <w:pPr>
+        <w:tabs>
+          <w:tab w:val="num" w:pos="5760"/>
+        </w:tabs>
+        <w:ind w:left="5760" w:hanging="360"/>
+      </w:pPr>
+      <w:rPr>
+        <w:rFonts w:ascii="Wingdings" w:hAnsi="Wingdings" w:hint="default"/>
+        <w:sz w:val="20"/>
+      </w:rPr>
+    </w:lvl>
+    <w:lvl w:ilvl="8" w:tentative="1">
+      <w:start w:val="1"/>
+      <w:numFmt w:val="bullet"/>
+      <w:lvlText w:val=""/>
+      <w:lvlJc w:val="left"/>
+      <w:pPr>
+        <w:tabs>
+          <w:tab w:val="num" w:pos="6480"/>
+        </w:tabs>
+        <w:ind w:left="6480" w:hanging="360"/>
+      </w:pPr>
+      <w:rPr>
+        <w:rFonts w:ascii="Wingdings" w:hAnsi="Wingdings" w:hint="default"/>
+        <w:sz w:val="20"/>
+      </w:rPr>
+    </w:lvl>
+  </w:abstractNum>
+  <w:abstractNum w:abstractNumId="15" w15:restartNumberingAfterBreak="0">
+    <w:nsid w:val="4B1E1432"/>
+    <w:multiLevelType w:val="multilevel"/>
+    <w:tmpl w:val="05C0FC9A"/>
+    <w:lvl w:ilvl="0">
+      <w:start w:val="1"/>
+      <w:numFmt w:val="bullet"/>
+      <w:lvlText w:val=""/>
+      <w:lvlJc w:val="left"/>
+      <w:pPr>
+        <w:tabs>
+          <w:tab w:val="num" w:pos="720"/>
+        </w:tabs>
+        <w:ind w:left="720" w:hanging="360"/>
+      </w:pPr>
+      <w:rPr>
+        <w:rFonts w:ascii="Symbol" w:hAnsi="Symbol" w:hint="default"/>
+        <w:sz w:val="20"/>
+      </w:rPr>
+    </w:lvl>
+    <w:lvl w:ilvl="1" w:tentative="1">
+      <w:start w:val="1"/>
+      <w:numFmt w:val="bullet"/>
+      <w:lvlText w:val="o"/>
+      <w:lvlJc w:val="left"/>
+      <w:pPr>
+        <w:tabs>
+          <w:tab w:val="num" w:pos="1440"/>
+        </w:tabs>
+        <w:ind w:left="1440" w:hanging="360"/>
+      </w:pPr>
+      <w:rPr>
+        <w:rFonts w:ascii="Courier New" w:hAnsi="Courier New" w:hint="default"/>
+        <w:sz w:val="20"/>
+      </w:rPr>
+    </w:lvl>
+    <w:lvl w:ilvl="2" w:tentative="1">
+      <w:start w:val="1"/>
+      <w:numFmt w:val="bullet"/>
+      <w:lvlText w:val=""/>
+      <w:lvlJc w:val="left"/>
+      <w:pPr>
+        <w:tabs>
+          <w:tab w:val="num" w:pos="2160"/>
+        </w:tabs>
+        <w:ind w:left="2160" w:hanging="360"/>
+      </w:pPr>
+      <w:rPr>
+        <w:rFonts w:ascii="Wingdings" w:hAnsi="Wingdings" w:hint="default"/>
+        <w:sz w:val="20"/>
+      </w:rPr>
+    </w:lvl>
+    <w:lvl w:ilvl="3" w:tentative="1">
+      <w:start w:val="1"/>
+      <w:numFmt w:val="bullet"/>
+      <w:lvlText w:val=""/>
+      <w:lvlJc w:val="left"/>
+      <w:pPr>
+        <w:tabs>
+          <w:tab w:val="num" w:pos="2880"/>
+        </w:tabs>
+        <w:ind w:left="2880" w:hanging="360"/>
+      </w:pPr>
+      <w:rPr>
+        <w:rFonts w:ascii="Wingdings" w:hAnsi="Wingdings" w:hint="default"/>
+        <w:sz w:val="20"/>
+      </w:rPr>
+    </w:lvl>
+    <w:lvl w:ilvl="4" w:tentative="1">
+      <w:start w:val="1"/>
+      <w:numFmt w:val="bullet"/>
+      <w:lvlText w:val=""/>
+      <w:lvlJc w:val="left"/>
+      <w:pPr>
+        <w:tabs>
+          <w:tab w:val="num" w:pos="3600"/>
+        </w:tabs>
+        <w:ind w:left="3600" w:hanging="360"/>
+      </w:pPr>
+      <w:rPr>
+        <w:rFonts w:ascii="Wingdings" w:hAnsi="Wingdings" w:hint="default"/>
+        <w:sz w:val="20"/>
+      </w:rPr>
+    </w:lvl>
+    <w:lvl w:ilvl="5" w:tentative="1">
+      <w:start w:val="1"/>
+      <w:numFmt w:val="bullet"/>
+      <w:lvlText w:val=""/>
+      <w:lvlJc w:val="left"/>
+      <w:pPr>
+        <w:tabs>
+          <w:tab w:val="num" w:pos="4320"/>
+        </w:tabs>
+        <w:ind w:left="4320" w:hanging="360"/>
+      </w:pPr>
+      <w:rPr>
+        <w:rFonts w:ascii="Wingdings" w:hAnsi="Wingdings" w:hint="default"/>
+        <w:sz w:val="20"/>
+      </w:rPr>
+    </w:lvl>
+    <w:lvl w:ilvl="6" w:tentative="1">
+      <w:start w:val="1"/>
+      <w:numFmt w:val="bullet"/>
+      <w:lvlText w:val=""/>
+      <w:lvlJc w:val="left"/>
+      <w:pPr>
+        <w:tabs>
+          <w:tab w:val="num" w:pos="5040"/>
+        </w:tabs>
+        <w:ind w:left="5040" w:hanging="360"/>
+      </w:pPr>
+      <w:rPr>
+        <w:rFonts w:ascii="Wingdings" w:hAnsi="Wingdings" w:hint="default"/>
+        <w:sz w:val="20"/>
+      </w:rPr>
+    </w:lvl>
+    <w:lvl w:ilvl="7" w:tentative="1">
+      <w:start w:val="1"/>
+      <w:numFmt w:val="bullet"/>
+      <w:lvlText w:val=""/>
+      <w:lvlJc w:val="left"/>
+      <w:pPr>
+        <w:tabs>
+          <w:tab w:val="num" w:pos="5760"/>
+        </w:tabs>
+        <w:ind w:left="5760" w:hanging="360"/>
+      </w:pPr>
+      <w:rPr>
+        <w:rFonts w:ascii="Wingdings" w:hAnsi="Wingdings" w:hint="default"/>
+        <w:sz w:val="20"/>
+      </w:rPr>
+    </w:lvl>
+    <w:lvl w:ilvl="8" w:tentative="1">
+      <w:start w:val="1"/>
+      <w:numFmt w:val="bullet"/>
+      <w:lvlText w:val=""/>
+      <w:lvlJc w:val="left"/>
+      <w:pPr>
+        <w:tabs>
+          <w:tab w:val="num" w:pos="6480"/>
+        </w:tabs>
+        <w:ind w:left="6480" w:hanging="360"/>
+      </w:pPr>
+      <w:rPr>
+        <w:rFonts w:ascii="Wingdings" w:hAnsi="Wingdings" w:hint="default"/>
+        <w:sz w:val="20"/>
+      </w:rPr>
+    </w:lvl>
+  </w:abstractNum>
+  <w:abstractNum w:abstractNumId="16" w15:restartNumberingAfterBreak="0">
     <w:nsid w:val="4DD06759"/>
     <w:multiLevelType w:val="multilevel"/>
     <w:tmpl w:val="0D1662BA"/>
@@ -3333,7 +3571,7 @@
       </w:pPr>
     </w:lvl>
   </w:abstractNum>
-  <w:abstractNum w:abstractNumId="14" w15:restartNumberingAfterBreak="0">
+  <w:abstractNum w:abstractNumId="17" w15:restartNumberingAfterBreak="0">
     <w:nsid w:val="552079B3"/>
     <w:multiLevelType w:val="hybridMultilevel"/>
     <w:tmpl w:val="4802FEE2"/>
@@ -3419,7 +3657,7 @@
       </w:pPr>
     </w:lvl>
   </w:abstractNum>
-  <w:abstractNum w:abstractNumId="15" w15:restartNumberingAfterBreak="0">
+  <w:abstractNum w:abstractNumId="18" w15:restartNumberingAfterBreak="0">
     <w:nsid w:val="57257035"/>
     <w:multiLevelType w:val="multilevel"/>
     <w:tmpl w:val="F2DC6952"/>
@@ -3532,7 +3770,7 @@
       </w:rPr>
     </w:lvl>
   </w:abstractNum>
-  <w:abstractNum w:abstractNumId="16" w15:restartNumberingAfterBreak="0">
+  <w:abstractNum w:abstractNumId="19" w15:restartNumberingAfterBreak="0">
     <w:nsid w:val="5A0E07D9"/>
     <w:multiLevelType w:val="multilevel"/>
     <w:tmpl w:val="6FB03AC0"/>
@@ -3623,7 +3861,7 @@
       </w:pPr>
     </w:lvl>
   </w:abstractNum>
-  <w:abstractNum w:abstractNumId="17" w15:restartNumberingAfterBreak="0">
+  <w:abstractNum w:abstractNumId="20" w15:restartNumberingAfterBreak="0">
     <w:nsid w:val="5B016D05"/>
     <w:multiLevelType w:val="hybridMultilevel"/>
     <w:tmpl w:val="6DE450B6"/>
@@ -3709,7 +3947,7 @@
       </w:pPr>
     </w:lvl>
   </w:abstractNum>
-  <w:abstractNum w:abstractNumId="18" w15:restartNumberingAfterBreak="0">
+  <w:abstractNum w:abstractNumId="21" w15:restartNumberingAfterBreak="0">
     <w:nsid w:val="5E2C0F13"/>
     <w:multiLevelType w:val="hybridMultilevel"/>
     <w:tmpl w:val="0AC69352"/>
@@ -3822,7 +4060,7 @@
       </w:rPr>
     </w:lvl>
   </w:abstractNum>
-  <w:abstractNum w:abstractNumId="19" w15:restartNumberingAfterBreak="0">
+  <w:abstractNum w:abstractNumId="22" w15:restartNumberingAfterBreak="0">
     <w:nsid w:val="5FBB5B37"/>
     <w:multiLevelType w:val="hybridMultilevel"/>
     <w:tmpl w:val="DE1EC550"/>
@@ -3935,7 +4173,7 @@
       </w:rPr>
     </w:lvl>
   </w:abstractNum>
-  <w:abstractNum w:abstractNumId="20" w15:restartNumberingAfterBreak="0">
+  <w:abstractNum w:abstractNumId="23" w15:restartNumberingAfterBreak="0">
     <w:nsid w:val="687C1D67"/>
     <w:multiLevelType w:val="hybridMultilevel"/>
     <w:tmpl w:val="6CA47232"/>
@@ -4021,7 +4259,7 @@
       </w:pPr>
     </w:lvl>
   </w:abstractNum>
-  <w:abstractNum w:abstractNumId="21" w15:restartNumberingAfterBreak="0">
+  <w:abstractNum w:abstractNumId="24" w15:restartNumberingAfterBreak="0">
     <w:nsid w:val="6A521AFE"/>
     <w:multiLevelType w:val="hybridMultilevel"/>
     <w:tmpl w:val="BD284838"/>
@@ -4134,7 +4372,7 @@
       </w:rPr>
     </w:lvl>
   </w:abstractNum>
-  <w:abstractNum w:abstractNumId="22" w15:restartNumberingAfterBreak="0">
+  <w:abstractNum w:abstractNumId="25" w15:restartNumberingAfterBreak="0">
     <w:nsid w:val="6BFA25E0"/>
     <w:multiLevelType w:val="hybridMultilevel"/>
     <w:tmpl w:val="3ECED65A"/>
@@ -4250,7 +4488,7 @@
       </w:rPr>
     </w:lvl>
   </w:abstractNum>
-  <w:abstractNum w:abstractNumId="23" w15:restartNumberingAfterBreak="0">
+  <w:abstractNum w:abstractNumId="26" w15:restartNumberingAfterBreak="0">
     <w:nsid w:val="70E71A32"/>
     <w:multiLevelType w:val="hybridMultilevel"/>
     <w:tmpl w:val="5B240638"/>
@@ -4363,7 +4601,7 @@
       </w:rPr>
     </w:lvl>
   </w:abstractNum>
-  <w:abstractNum w:abstractNumId="24" w15:restartNumberingAfterBreak="0">
+  <w:abstractNum w:abstractNumId="27" w15:restartNumberingAfterBreak="0">
     <w:nsid w:val="75550C2F"/>
     <w:multiLevelType w:val="multilevel"/>
     <w:tmpl w:val="4C92CC38"/>
@@ -4449,7 +4687,7 @@
       </w:pPr>
     </w:lvl>
   </w:abstractNum>
-  <w:abstractNum w:abstractNumId="25" w15:restartNumberingAfterBreak="0">
+  <w:abstractNum w:abstractNumId="28" w15:restartNumberingAfterBreak="0">
     <w:nsid w:val="76764FAB"/>
     <w:multiLevelType w:val="multilevel"/>
     <w:tmpl w:val="0E4CCD58"/>
@@ -4599,16 +4837,16 @@
     </w:lvl>
   </w:abstractNum>
   <w:num w:numId="1" w16cid:durableId="1047610640">
-    <w:abstractNumId w:val="16"/>
+    <w:abstractNumId w:val="19"/>
   </w:num>
   <w:num w:numId="2" w16cid:durableId="92479509">
     <w:abstractNumId w:val="2"/>
   </w:num>
   <w:num w:numId="3" w16cid:durableId="739249301">
-    <w:abstractNumId w:val="15"/>
+    <w:abstractNumId w:val="18"/>
   </w:num>
   <w:num w:numId="4" w16cid:durableId="127940527">
-    <w:abstractNumId w:val="24"/>
+    <w:abstractNumId w:val="27"/>
   </w:num>
   <w:num w:numId="5" w16cid:durableId="1923754967">
     <w:abstractNumId w:val="1"/>
@@ -4620,61 +4858,70 @@
     <w:abstractNumId w:val="3"/>
   </w:num>
   <w:num w:numId="8" w16cid:durableId="1117335023">
-    <w:abstractNumId w:val="13"/>
+    <w:abstractNumId w:val="16"/>
   </w:num>
   <w:num w:numId="9" w16cid:durableId="2079596706">
     <w:abstractNumId w:val="6"/>
   </w:num>
   <w:num w:numId="10" w16cid:durableId="1423452171">
-    <w:abstractNumId w:val="12"/>
+    <w:abstractNumId w:val="13"/>
   </w:num>
   <w:num w:numId="11" w16cid:durableId="185753553">
     <w:abstractNumId w:val="4"/>
   </w:num>
   <w:num w:numId="12" w16cid:durableId="2015718147">
+    <w:abstractNumId w:val="12"/>
+  </w:num>
+  <w:num w:numId="13" w16cid:durableId="2079356006">
     <w:abstractNumId w:val="11"/>
   </w:num>
-  <w:num w:numId="13" w16cid:durableId="2079356006">
-    <w:abstractNumId w:val="10"/>
-  </w:num>
   <w:num w:numId="14" w16cid:durableId="2898642">
-    <w:abstractNumId w:val="14"/>
+    <w:abstractNumId w:val="17"/>
   </w:num>
   <w:num w:numId="15" w16cid:durableId="2090883220">
-    <w:abstractNumId w:val="23"/>
+    <w:abstractNumId w:val="26"/>
   </w:num>
   <w:num w:numId="16" w16cid:durableId="519397884">
-    <w:abstractNumId w:val="18"/>
+    <w:abstractNumId w:val="21"/>
   </w:num>
   <w:num w:numId="17" w16cid:durableId="1359158997">
     <w:abstractNumId w:val="0"/>
   </w:num>
   <w:num w:numId="18" w16cid:durableId="1979341473">
-    <w:abstractNumId w:val="22"/>
+    <w:abstractNumId w:val="25"/>
   </w:num>
   <w:num w:numId="19" w16cid:durableId="903636133">
     <w:abstractNumId w:val="5"/>
   </w:num>
   <w:num w:numId="20" w16cid:durableId="645429851">
-    <w:abstractNumId w:val="25"/>
+    <w:abstractNumId w:val="28"/>
   </w:num>
   <w:num w:numId="21" w16cid:durableId="1137604429">
     <w:abstractNumId w:val="7"/>
   </w:num>
   <w:num w:numId="22" w16cid:durableId="756363996">
-    <w:abstractNumId w:val="17"/>
+    <w:abstractNumId w:val="20"/>
   </w:num>
   <w:num w:numId="23" w16cid:durableId="966088655">
-    <w:abstractNumId w:val="20"/>
+    <w:abstractNumId w:val="23"/>
   </w:num>
   <w:num w:numId="24" w16cid:durableId="1597517513">
-    <w:abstractNumId w:val="19"/>
+    <w:abstractNumId w:val="22"/>
   </w:num>
   <w:num w:numId="25" w16cid:durableId="2066953030">
-    <w:abstractNumId w:val="9"/>
+    <w:abstractNumId w:val="10"/>
   </w:num>
   <w:num w:numId="26" w16cid:durableId="1266114278">
-    <w:abstractNumId w:val="21"/>
+    <w:abstractNumId w:val="24"/>
+  </w:num>
+  <w:num w:numId="27" w16cid:durableId="310259843">
+    <w:abstractNumId w:val="14"/>
+  </w:num>
+  <w:num w:numId="28" w16cid:durableId="431783183">
+    <w:abstractNumId w:val="15"/>
+  </w:num>
+  <w:num w:numId="29" w16cid:durableId="83108968">
+    <w:abstractNumId w:val="9"/>
   </w:num>
 </w:numbering>
 </file>
@@ -5636,28 +5883,28 @@
 </file>
 
 <file path=customXml/item1.xml><?xml version="1.0" encoding="utf-8"?>
+<b:Sources xmlns:b="http://schemas.openxmlformats.org/officeDocument/2006/bibliography" xmlns="http://schemas.openxmlformats.org/officeDocument/2006/bibliography" SelectedStyle="\APA.XSL" StyleName="APA"/>
+</file>
+
+<file path=customXml/item2.xml><?xml version="1.0" encoding="utf-8"?>
 <go:gDocsCustomXmlDataStorage xmlns:go="http://customooxmlschemas.google.com/" xmlns:r="http://schemas.openxmlformats.org/officeDocument/2006/relationships" uri="GoogleDocsCustomDataVersion2">
   <go:docsCustomData xmlns:go="http://customooxmlschemas.google.com/" roundtripDataSignature="AMtx7miEk1H21JdIr+TOyvqwi2eW5alUKQ==">CgMxLjAyCGguZ2pkZ3hzOAByITE3THlTaDhNVjRLalVlWXlDajNGS3JlSGtMYWNhX3pNQQ==</go:docsCustomData>
 </go:gDocsCustomXmlDataStorage>
 </file>
 
-<file path=customXml/item2.xml><?xml version="1.0" encoding="utf-8"?>
-<b:Sources xmlns:b="http://schemas.openxmlformats.org/officeDocument/2006/bibliography" xmlns="http://schemas.openxmlformats.org/officeDocument/2006/bibliography" SelectedStyle="\APA.XSL" StyleName="APA"/>
+<file path=customXml/itemProps1.xml><?xml version="1.0" encoding="utf-8"?>
+<ds:datastoreItem xmlns:ds="http://schemas.openxmlformats.org/officeDocument/2006/customXml" ds:itemID="{19DB2FBD-D5D2-4A8E-B370-7C96318831C9}">
+  <ds:schemaRefs>
+    <ds:schemaRef ds:uri="http://schemas.openxmlformats.org/officeDocument/2006/bibliography"/>
+  </ds:schemaRefs>
+</ds:datastoreItem>
 </file>
 
-<file path=customXml/itemProps1.xml><?xml version="1.0" encoding="utf-8"?>
+<file path=customXml/itemProps2.xml><?xml version="1.0" encoding="utf-8"?>
 <ds:datastoreItem xmlns:ds="http://schemas.openxmlformats.org/officeDocument/2006/customXml" ds:itemID="{11111111-1234-1234-1234-123412341234}">
   <ds:schemaRefs>
     <ds:schemaRef ds:uri="http://customooxmlschemas.google.com/"/>
     <ds:schemaRef ds:uri="http://schemas.openxmlformats.org/officeDocument/2006/relationships"/>
   </ds:schemaRefs>
 </ds:datastoreItem>
-</file>
-
-<file path=customXml/itemProps2.xml><?xml version="1.0" encoding="utf-8"?>
-<ds:datastoreItem xmlns:ds="http://schemas.openxmlformats.org/officeDocument/2006/customXml" ds:itemID="{19DB2FBD-D5D2-4A8E-B370-7C96318831C9}">
-  <ds:schemaRefs>
-    <ds:schemaRef ds:uri="http://schemas.openxmlformats.org/officeDocument/2006/bibliography"/>
-  </ds:schemaRefs>
-</ds:datastoreItem>
 </file>
</xml_diff>